<commit_message>
Use only 2021-2026 sources in both reports
- UniGuard: replace pre-2021 references with 2021-2026 papers on
  ransomware entropy detection, backup economics, encrypted
  deduplication, memory-hard KDFs, hash-chain logging, Nigerian
  university cybersecurity readiness and campus power outages; cite
  NIST CSF 2.0, SP 800-61r3, Pfleeger 6th ed. and the 2024 Cybercrimes
  Amendment Act
- AgroPeace: replace ICG, ACLED 2010, Ushahidi 2009 and RFC citations
  with 2021-2026 studies of the Benue conflict, GIS and GPS tracking of
  herds, conflict early warning systems, crowdsourcing credibility and
  misinformation
- Slides and defense sheets updated to the same sources

Co-Authored-By: Claude Opus 5.5 <noreply@anthropic.com>
Claude-Session: https://claude.ai/code/session_01JZqqg7YJpsctVq4ZMmHoXB
</commit_message>
<xml_diff>
--- a/project1-uniguard/docs/UniGuard_Defense_QA.docx
+++ b/project1-uniguard/docs/UniGuard_Defense_QA.docx
@@ -93,7 +93,7 @@
         <w:spacing w:after="120" w:line="300"/>
       </w:pPr>
       <w:r>
-        <w:t xml:space="preserve">All ten topics. The CIA triad drives the design. The threat model covers intrusion, breaches, vulnerabilities and classes of attack. Controls cover defence methods. AES-GCM, scrypt and HKDF cover encryption and decryption. The SQLite audit log covers database security. Service checks and dashboard hardening cover network security. ISO 27001, NIST SP 800-34 and 800-61, and NDPA 2023 cover policies and standards. Table 4.5 in the report maps each one.</w:t>
+        <w:t xml:space="preserve">All ten topics. The CIA triad drives the design. The threat model covers intrusion, breaches, vulnerabilities and classes of attack. Controls cover defence methods. AES-GCM, scrypt and HKDF cover encryption and decryption. The SQLite audit log covers database security. Service checks and dashboard hardening cover network security. ISO/IEC 27001:2022, NIST CSF 2.0, NIST SP 800-61 Rev. 3, NDPA 2023 and the Cybercrimes (Amendment) Act 2024 cover policies and standards. Table 4.5 in the report maps each one.</w:t>
       </w:r>
     </w:p>
     <w:p>
@@ -1026,7 +1026,7 @@
         <w:spacing w:after="80"/>
       </w:pPr>
       <w:r>
-        <w:t xml:space="preserve">12 national grid collapses in 2024; NDPA 2023 s.39 security, s.40 breach report in 72 hours</w:t>
+        <w:t xml:space="preserve">39% of respondents in Nigerian tertiary institutions face 4 to 6 hours of power outage daily (Ibrahim et al., 2026); NDPA 2023 s.39 security, s.40 breach report in 72 hours; Cybercrimes (Amendment) Act 2024: report attacks to the national CERT within 72 hours</w:t>
       </w:r>
     </w:p>
     <w:sectPr>

</xml_diff>

<commit_message>
Point demo runbooks and speaker notes at the one-command launchers
Co-Authored-By: Claude Opus 5.5 <noreply@anthropic.com>
Claude-Session: https://claude.ai/code/session_01JZqqg7YJpsctVq4ZMmHoXB
</commit_message>
<xml_diff>
--- a/project1-uniguard/docs/UniGuard_Defense_QA.docx
+++ b/project1-uniguard/docs/UniGuard_Defense_QA.docx
@@ -823,7 +823,7 @@
         <w:spacing w:after="100"/>
       </w:pPr>
       <w:r>
-        <w:t xml:space="preserve">Before the panel: open three terminals in the project1-uniguard folder and delete demo/sandbox.</w:t>
+        <w:t xml:space="preserve">Before the panel: open two command windows in the project1-uniguard folder and activate .venv in both (see SETUP_GUIDE).</w:t>
       </w:r>
     </w:p>
     <w:p>
@@ -836,7 +836,7 @@
         <w:spacing w:after="100"/>
       </w:pPr>
       <w:r>
-        <w:t xml:space="preserve">Terminal 1: python demo/seed_data.py, set UNIGUARD_PASSPHRASE and UNIGUARD_DASHBOARD_PASSWORD, run init, then run --dashboard.</w:t>
+        <w:t xml:space="preserve">Window 1: python demo/live.py --fresh. The browser opens http://127.0.0.1:8080. Log in with cmp468. Zoom to 125% for the projector.</w:t>
       </w:r>
     </w:p>
     <w:p>
@@ -849,7 +849,7 @@
         <w:spacing w:after="100"/>
       </w:pPr>
       <w:r>
-        <w:t xml:space="preserve">Terminal 2: python demo/fake_portal.py</w:t>
+        <w:t xml:space="preserve">Scene 1: python demo/simulate_incident.py power-off. Point at the amber ON BATTERY card and the new power-loss snapshot.</w:t>
       </w:r>
     </w:p>
     <w:p>
@@ -862,7 +862,7 @@
         <w:spacing w:after="100"/>
       </w:pPr>
       <w:r>
-        <w:t xml:space="preserve">Browser: http://127.0.0.1:8080, log in with the dashboard password. Zoom to 125% for the projector.</w:t>
+        <w:t xml:space="preserve">Scene 2: python demo/simulate_incident.py power-on, then portal-down. Point at Student Portal DOWN (HTTP 503). Then portal-up.</w:t>
       </w:r>
     </w:p>
     <w:p>
@@ -875,7 +875,7 @@
         <w:spacing w:after="100"/>
       </w:pPr>
       <w:r>
-        <w:t xml:space="preserve">Scene 1: python demo/simulate_incident.py power-off. Point at the amber ON BATTERY card and the new power-loss snapshot.</w:t>
+        <w:t xml:space="preserve">Scene 3: python demo/simulate_incident.py tamper. Point at the red RECORDS ALERT banner.</w:t>
       </w:r>
     </w:p>
     <w:p>
@@ -888,7 +888,7 @@
         <w:spacing w:after="100"/>
       </w:pPr>
       <w:r>
-        <w:t xml:space="preserve">Scene 2: python demo/simulate_incident.py power-on. Then press Ctrl+C in terminal 2. Point at Student Portal DOWN.</w:t>
+        <w:t xml:space="preserve">Scene 4: python demo/simulate_incident.py ransomware. Point at the incident row: restored, quarantined, recovery time.</w:t>
       </w:r>
     </w:p>
     <w:p>
@@ -901,33 +901,7 @@
         <w:spacing w:after="100"/>
       </w:pPr>
       <w:r>
-        <w:t xml:space="preserve">Scene 3: python demo/simulate_incident.py tamper. Point at the red RECORDS ALERT banner.</w:t>
-      </w:r>
-    </w:p>
-    <w:p>
-      <w:pPr>
-        <w:pStyle w:val="ListParagraph"/>
-        <w:numPr>
-          <w:ilvl w:val="0"/>
-          <w:numId w:val="2"/>
-        </w:numPr>
-        <w:spacing w:after="100"/>
-      </w:pPr>
-      <w:r>
-        <w:t xml:space="preserve">Scene 4: python demo/simulate_incident.py ransomware. Point at the incident row: restored, quarantined, recovery time.</w:t>
-      </w:r>
-    </w:p>
-    <w:p>
-      <w:pPr>
-        <w:pStyle w:val="ListParagraph"/>
-        <w:numPr>
-          <w:ilvl w:val="0"/>
-          <w:numId w:val="2"/>
-        </w:numPr>
-        <w:spacing w:after="100"/>
-      </w:pPr>
-      <w:r>
-        <w:t xml:space="preserve">Scene 5: click Verify backups. Then in terminal 3: python -m uniguard -c demo/demo_config.json audit</w:t>
+        <w:t xml:space="preserve">Scene 5: click Verify backups. Then set UNIGUARD_PASSPHRASE in window 2 and run python -m uniguard -c demo/demo_config.json audit</w:t>
       </w:r>
     </w:p>
     <w:p>

</xml_diff>